<commit_message>
docs: 산출물 4종 재생성 — 회원 웹 화면 판정, D46~D50·인사 ADR-STF-05~08 반영 (log/111)
- requirements.py: 라우트 설명 3개 추가(/audit-logs는 공통 COM — 사용자 결정), 화면 판정에 member-web 포함, /branches/public 와일드카드 오탐 수정, 낡은 설명·표지 갱신(ADR-MEM-04·05, ADR-STF-08, D43·D47, ADR-RSV-05)
- data_definition.py: AuditLog 설명·action 5종(D44·D47·ADR-STF-07), 미사용 테이블 6개 사유
- proposal.js: 계약 종료 처리·인사·자산 화면, 회원 웹 배포, 처리 성능 D50, 경과 10/7~12, 규모·미구현 표, 결론 우선순위
- architecture.js: Session pooler(D49)·쿼리 상한 5초, 지점 검사 중앙화(D46), 인증·개인정보(ADR-AUTH-04·05, ADR-MEM-04, D47), 인사·계약 흐름(ADR-STF-05~08), 8장 성능 비교(D48~D50), 9장 D41~D50, 10장 갱신
- 그림 arch·iso는 산출물 전용 사본 figs-deliverables.js(사용자 결정 — 발표자료 figs-45.js는 그대로)
- docs/deliverables 4종 재생성, STATUS·log/111

Co-Authored-By: Claude Opus 5.5 <noreply@anthropic.com>
Claude-Session: https://claude.ai/code/session_01Drt3pYtY25R7kBjT9RrJUq
</commit_message>
<xml_diff>
--- a/docs/deliverables/기업분석및제안서.docx
+++ b/docs/deliverables/기업분석및제안서.docx
@@ -314,7 +314,7 @@
                 <w:sz w:val="18"/>
                 <w:szCs w:val="18"/>
               </w:rPr>
-              <w:t xml:space="preserve">2026-10-06</w:t>
+              <w:t xml:space="preserve">2026-10-14</w:t>
             </w:r>
           </w:p>
         </w:tc>
@@ -2768,7 +2768,7 @@
                 <w:sz w:val="18"/>
                 <w:szCs w:val="18"/>
               </w:rPr>
-              <w:t xml:space="preserve">파견 종료 + 본사 재배치 대상 등재</w:t>
+              <w:t xml:space="preserve">파견 종료 + 본사 재배치 대기 목록</w:t>
             </w:r>
           </w:p>
         </w:tc>
@@ -2794,12 +2794,10 @@
             </w:pPr>
             <w:r>
               <w:rPr>
-                <w:b/>
-                <w:bCs/>
-                <w:sz w:val="18"/>
-                <w:szCs w:val="18"/>
-              </w:rPr>
-              <w:t xml:space="preserve">설계만(미구현)</w:t>
+                <w:sz w:val="18"/>
+                <w:szCs w:val="18"/>
+              </w:rPr>
+              <w:t xml:space="preserve">구현 — 종료 처리와 같은 트랜잭션</w:t>
             </w:r>
           </w:p>
         </w:tc>
@@ -2859,7 +2857,7 @@
                 <w:sz w:val="18"/>
                 <w:szCs w:val="18"/>
               </w:rPr>
-              <w:t xml:space="preserve">개인 퇴사와 별개로 본사가 정책 결정</w:t>
+              <w:t xml:space="preserve">일괄 비활성화하지 않고, 남기지 않을 직원은 본사가 퇴사 처리</w:t>
             </w:r>
           </w:p>
         </w:tc>
@@ -2888,7 +2886,7 @@
                 <w:sz w:val="18"/>
                 <w:szCs w:val="18"/>
               </w:rPr>
-              <w:t xml:space="preserve">쓰기 차단 + 수동 비활성화로 결정</w:t>
+              <w:t xml:space="preserve">구현</w:t>
             </w:r>
           </w:p>
         </w:tc>
@@ -2961,65 +2959,7 @@
         <w:spacing w:after="60" w:line="290"/>
       </w:pPr>
       <w:r>
-        <w:t xml:space="preserve">갱신임박 자동 전환(종료일 60일 전 배치)은 스케줄러가 필요해 </w:t>
-      </w:r>
-      <w:r>
-        <w:rPr>
-          <w:b/>
-          <w:bCs/>
-        </w:rPr>
-        <w:t xml:space="preserve">아직 없다.</w:t>
-      </w:r>
-      <w:r>
-        <w:t xml:space="preserve"> 지금은 계약 상태를 데이터로 관리한다.</w:t>
-      </w:r>
-    </w:p>
-    <w:p>
-      <w:pPr>
-        <w:pStyle w:val="Heading2"/>
-      </w:pPr>
-      <w:r>
-        <w:t xml:space="preserve">2.5 인력 운용 — 파견·근태·연차</w:t>
-      </w:r>
-    </w:p>
-    <w:p>
-      <w:pPr>
-        <w:pStyle w:val="Heading3"/>
-      </w:pPr>
-      <w:r>
-        <w:t xml:space="preserve">실무</w:t>
-      </w:r>
-    </w:p>
-    <w:p>
-      <w:pPr>
-        <w:spacing w:after="120" w:line="300"/>
-      </w:pPr>
-      <w:r>
-        <w:t xml:space="preserve">채용과 재배치는 본사만 결정하고, 지점 관리자는 파견된 인력의 일상 관리만 한다. 시설은 주 7일 운영되므로 직원은 요일별 교대·정기휴무로 일한다. 휴가는 종류마다 다르다 — 연차만 잔여일수에서 차감되고, 병가·경조사는 승인해도 연차를 건드리지 않는다.</w:t>
-      </w:r>
-    </w:p>
-    <w:p>
-      <w:pPr>
-        <w:pStyle w:val="Heading3"/>
-      </w:pPr>
-      <w:r>
-        <w:t xml:space="preserve">분석</w:t>
-      </w:r>
-    </w:p>
-    <w:p>
-      <w:pPr>
-        <w:spacing w:after="120" w:line="300"/>
-      </w:pPr>
-      <w:r>
-        <w:t xml:space="preserve">결근을 "출근 체크가 없고 승인된 휴가도 없으면 결근"으로만 판정하면, 직원 개인의 정기휴무일마다 매주 오판정이 생긴다. 근무일이 고정되지 않은 파트타임은 자동 판정 자체가 맞지 않는다.</w:t>
-      </w:r>
-    </w:p>
-    <w:p>
-      <w:pPr>
-        <w:pStyle w:val="Heading3"/>
-      </w:pPr>
-      <w:r>
-        <w:t xml:space="preserve">시스템 반영</w:t>
+        <w:t xml:space="preserve">계약 상태는 본사가 지점 상세의 "계약 상태 변경"으로 바꾼다. 종료로 바꾸면 그 지점에 파견 중이던 직원의 파견이 같은 처리 안에서 끝나고, 재배치할 직원이 결과 창과 직원 화면의 "재배치 대기"에 나온다.</w:t>
       </w:r>
     </w:p>
     <w:p>
@@ -3032,17 +2972,62 @@
         <w:spacing w:after="60" w:line="290"/>
       </w:pPr>
       <w:r>
-        <w:t xml:space="preserve">직원의 소속은 </w:t>
+        <w:t xml:space="preserve">갱신임박 자동 전환(종료일 60일 전 배치)은 스케줄러가 필요해 </w:t>
       </w:r>
       <w:r>
         <w:rPr>
           <w:b/>
           <w:bCs/>
         </w:rPr>
-        <w:t xml:space="preserve">파견 이력</w:t>
-      </w:r>
-      <w:r>
-        <w:t xml:space="preserve">으로 관리한다. 직원당 진행 중 파견은 1건이고, 재배치하면 옛 지점의 담당 회원 관계를 같은 처리 안에서 정리한다.</w:t>
+        <w:t xml:space="preserve">아직 없다.</w:t>
+      </w:r>
+    </w:p>
+    <w:p>
+      <w:pPr>
+        <w:pStyle w:val="Heading2"/>
+      </w:pPr>
+      <w:r>
+        <w:t xml:space="preserve">2.5 인력 운용 — 파견·근태·연차</w:t>
+      </w:r>
+    </w:p>
+    <w:p>
+      <w:pPr>
+        <w:pStyle w:val="Heading3"/>
+      </w:pPr>
+      <w:r>
+        <w:t xml:space="preserve">실무</w:t>
+      </w:r>
+    </w:p>
+    <w:p>
+      <w:pPr>
+        <w:spacing w:after="120" w:line="300"/>
+      </w:pPr>
+      <w:r>
+        <w:t xml:space="preserve">채용과 재배치는 본사만 결정하고, 지점 관리자는 파견된 인력의 일상 관리만 한다. 시설은 주 7일 운영되므로 직원은 요일별 교대·정기휴무로 일한다. 휴가는 종류마다 다르다 — 연차만 잔여일수에서 차감되고, 병가·경조사는 승인해도 연차를 건드리지 않는다.</w:t>
+      </w:r>
+    </w:p>
+    <w:p>
+      <w:pPr>
+        <w:pStyle w:val="Heading3"/>
+      </w:pPr>
+      <w:r>
+        <w:t xml:space="preserve">분석</w:t>
+      </w:r>
+    </w:p>
+    <w:p>
+      <w:pPr>
+        <w:spacing w:after="120" w:line="300"/>
+      </w:pPr>
+      <w:r>
+        <w:t xml:space="preserve">결근을 "출근 체크가 없고 승인된 휴가도 없으면 결근"으로만 판정하면, 직원 개인의 정기휴무일마다 매주 오판정이 생긴다. 근무일이 고정되지 않은 파트타임은 자동 판정 자체가 맞지 않는다.</w:t>
+      </w:r>
+    </w:p>
+    <w:p>
+      <w:pPr>
+        <w:pStyle w:val="Heading3"/>
+      </w:pPr>
+      <w:r>
+        <w:t xml:space="preserve">시스템 반영</w:t>
       </w:r>
     </w:p>
     <w:p>
@@ -3055,17 +3040,17 @@
         <w:spacing w:after="60" w:line="290"/>
       </w:pPr>
       <w:r>
-        <w:t xml:space="preserve">결근은 배치로 자동 확정하지 않고, 지점 관리자가 </w:t>
+        <w:t xml:space="preserve">직원의 소속은 </w:t>
       </w:r>
       <w:r>
         <w:rPr>
           <w:b/>
           <w:bCs/>
         </w:rPr>
-        <w:t xml:space="preserve">미리보기 후 명시적으로 확정</w:t>
-      </w:r>
-      <w:r>
-        <w:t xml:space="preserve">한다. 정기휴무 요일과 파트타임을 판정에서 뺀다.</w:t>
+        <w:t xml:space="preserve">파견 이력</w:t>
+      </w:r>
+      <w:r>
+        <w:t xml:space="preserve">으로 관리한다. 직원당 진행 중 파견은 1건이고, 재배치하면 옛 지점의 담당 회원 관계를 같은 처리 안에서 정리한다.</w:t>
       </w:r>
     </w:p>
     <w:p>
@@ -3078,17 +3063,17 @@
         <w:spacing w:after="60" w:line="290"/>
       </w:pPr>
       <w:r>
-        <w:t xml:space="preserve">연차는 </w:t>
+        <w:t xml:space="preserve">결근은 배치로 자동 확정하지 않고, 지점 관리자가 </w:t>
       </w:r>
       <w:r>
         <w:rPr>
           <w:b/>
           <w:bCs/>
         </w:rPr>
-        <w:t xml:space="preserve">승인 시점에만</w:t>
-      </w:r>
-      <w:r>
-        <w:t xml:space="preserve"> 차감한다. 잔여일수를 넘는 신청은 막지 않는다(관리자 재량 승인 실무 반영).</w:t>
+        <w:t xml:space="preserve">미리보기 후 명시적으로 확정</w:t>
+      </w:r>
+      <w:r>
+        <w:t xml:space="preserve">한다. 정기휴무 요일과 파트타임을 판정에서 뺀다.</w:t>
       </w:r>
     </w:p>
     <w:p>
@@ -3101,7 +3086,17 @@
         <w:spacing w:after="60" w:line="290"/>
       </w:pPr>
       <w:r>
-        <w:t xml:space="preserve">근태 기록은 그날 실제로 파견돼 있던 지점에 귀속한다. 재배치 후에도 과거 근태는 원래 지점 기준으로 남는다.</w:t>
+        <w:t xml:space="preserve">연차는 </w:t>
+      </w:r>
+      <w:r>
+        <w:rPr>
+          <w:b/>
+          <w:bCs/>
+        </w:rPr>
+        <w:t xml:space="preserve">승인 시점에만</w:t>
+      </w:r>
+      <w:r>
+        <w:t xml:space="preserve"> 차감한다. 잔여일수를 넘는 신청은 막지 않는다(관리자 재량 승인 실무 반영).</w:t>
       </w:r>
     </w:p>
     <w:p>
@@ -3114,6 +3109,32 @@
         <w:spacing w:after="60" w:line="290"/>
       </w:pPr>
       <w:r>
+        <w:t xml:space="preserve">근태 기록은 그날 실제로 파견돼 있던 지점에 귀속한다. 재배치 후에도 과거 근태는 원래 지점 기준으로 남는다.</w:t>
+      </w:r>
+    </w:p>
+    <w:p>
+      <w:pPr>
+        <w:pStyle w:val="ListParagraph"/>
+        <w:numPr>
+          <w:ilvl w:val="0"/>
+          <w:numId w:val="2"/>
+        </w:numPr>
+        <w:spacing w:after="60" w:line="290"/>
+      </w:pPr>
+      <w:r>
+        <w:t xml:space="preserve">채용·재배치·퇴사 화면이 있다. 계약이 끝난 지점의 직원은 본사가 재배치하거나 퇴사 처리한다.</w:t>
+      </w:r>
+    </w:p>
+    <w:p>
+      <w:pPr>
+        <w:pStyle w:val="ListParagraph"/>
+        <w:numPr>
+          <w:ilvl w:val="0"/>
+          <w:numId w:val="2"/>
+        </w:numPr>
+        <w:spacing w:after="60" w:line="290"/>
+      </w:pPr>
+      <w:r>
         <w:rPr>
           <w:b/>
           <w:bCs/>
@@ -3121,7 +3142,7 @@
         <w:t xml:space="preserve">미구현</w:t>
       </w:r>
       <w:r>
-        <w:t xml:space="preserve">: 채용·재배치·퇴사는 API만 있고 화면이 없다. 직원 본인의 인사정보 변경 신청·승인도 아직 없다.</w:t>
+        <w:t xml:space="preserve">: 직원 본인의 인사정보 변경 신청·승인, 관리자가 직원 업무일지를 여는 화면.</w:t>
       </w:r>
     </w:p>
     <w:p>
@@ -3382,7 +3403,7 @@
         <w:t xml:space="preserve">보류</w:t>
       </w:r>
       <w:r>
-        <w:t xml:space="preserve">: 재물조사 워크플로와 감가상각 장부가액 계산은 범위를 넓히는 일이라 보류했다. 자산 정보 수정은 API만 있고 화면이 없다.</w:t>
+        <w:t xml:space="preserve">: 재물조사 워크플로와 감가상각 장부가액 계산은 범위를 넓히는 일이라 보류했다.</w:t>
       </w:r>
     </w:p>
     <w:p>
@@ -4009,7 +4030,7 @@
                 <w:sz w:val="18"/>
                 <w:szCs w:val="18"/>
               </w:rPr>
-              <w:t xml:space="preserve">계약 상태 4단계, 종료 지점 신규 활동 차단</w:t>
+              <w:t xml:space="preserve">계약 상태 4단계, 종료 지점 신규 활동 차단, 계약 상태 변경 + 파견 자동 종료·재배치 대기</w:t>
             </w:r>
           </w:p>
         </w:tc>
@@ -4038,7 +4059,7 @@
                 <w:sz w:val="18"/>
                 <w:szCs w:val="18"/>
               </w:rPr>
-              <w:t xml:space="preserve">종료 시 파견 직원 처리, 갱신임박 자동 전환</w:t>
+              <w:t xml:space="preserve">갱신임박 자동 전환</w:t>
             </w:r>
           </w:p>
         </w:tc>
@@ -4127,7 +4148,7 @@
                 <w:sz w:val="18"/>
                 <w:szCs w:val="18"/>
               </w:rPr>
-              <w:t xml:space="preserve">API 전부, 파견 이력·권한 분리</w:t>
+              <w:t xml:space="preserve">API·화면, 파견 이력·권한 분리, 변경 이력·전화번호 열람 기록</w:t>
             </w:r>
           </w:p>
         </w:tc>
@@ -4156,7 +4177,7 @@
                 <w:sz w:val="18"/>
                 <w:szCs w:val="18"/>
               </w:rPr>
-              <w:t xml:space="preserve">채용·재배치·퇴사 화면, 변경 신청 승인</w:t>
+              <w:t xml:space="preserve">변경 신청 승인</w:t>
             </w:r>
           </w:p>
         </w:tc>
@@ -4274,7 +4295,7 @@
                 <w:sz w:val="18"/>
                 <w:szCs w:val="18"/>
               </w:rPr>
-              <w:t xml:space="preserve">결근 확정 화면</w:t>
+              <w:t xml:space="preserve">관리자의 업무일지 열람 화면</w:t>
             </w:r>
           </w:p>
         </w:tc>
@@ -4363,7 +4384,7 @@
                 <w:sz w:val="18"/>
                 <w:szCs w:val="18"/>
               </w:rPr>
-              <w:t xml:space="preserve">회원·수강·PT·예약·모의 결제·프로그램</w:t>
+              <w:t xml:space="preserve">회원·수강·PT·예약·모의 결제·프로그램, 회원 모바일 웹</w:t>
             </w:r>
           </w:p>
         </w:tc>
@@ -4392,7 +4413,7 @@
                 <w:sz w:val="18"/>
                 <w:szCs w:val="18"/>
               </w:rPr>
-              <w:t xml:space="preserve">결제 내역 화면, 캘린더형 예약</w:t>
+              <w:t xml:space="preserve">캘린더형 예약, 종목·시간대·연령대 필터</w:t>
             </w:r>
           </w:p>
         </w:tc>
@@ -4481,7 +4502,7 @@
                 <w:sz w:val="18"/>
                 <w:szCs w:val="18"/>
               </w:rPr>
-              <w:t xml:space="preserve">자산 대장·채번·상태 전이</w:t>
+              <w:t xml:space="preserve">자산 대장·채번·상태 전이·정보 수정</w:t>
             </w:r>
           </w:p>
         </w:tc>
@@ -4510,7 +4531,7 @@
                 <w:sz w:val="18"/>
                 <w:szCs w:val="18"/>
               </w:rPr>
-              <w:t xml:space="preserve">재물조사·감가상각(보류), 정보 수정 화면</w:t>
+              <w:t xml:space="preserve">재물조사·감가상각(보류)</w:t>
             </w:r>
           </w:p>
         </w:tc>
@@ -5074,7 +5095,7 @@
         <w:spacing w:after="120" w:line="300"/>
       </w:pPr>
       <w:r>
-        <w:t xml:space="preserve">관리자 웹(React)과 REST API(NestJS), PostgreSQL(Supabase, 서울)로 구성한다. API는 AWS Lambda(서울)에서 돌고, Cloudflare Worker가 화면과 API를 한 주소로 묶으며 로그인 요청 제한을 맡는다. 세부는 </w:t>
+        <w:t xml:space="preserve">관리자 웹·회원 모바일 웹(React)과 REST API(NestJS), PostgreSQL(Supabase, 서울)로 구성한다. API는 AWS Lambda(서울)에서 돌고, Cloudflare Worker가 화면과 API를 한 주소로 묶으며 로그인 요청 제한을 맡는다. 세부는 </w:t>
       </w:r>
       <w:r>
         <w:rPr>
@@ -5097,7 +5118,7 @@
           <wp:inline distT="0" distB="0" distL="0" distR="0">
             <wp:extent cx="4895850" cy="3429000"/>
             <wp:effectExtent t="0" r="0" b="0" l="0"/>
-            <wp:docPr id="1" name="arch" descr="그림 2. 시스템 구성 — 실선이 지금의 운영 경로" title="그림 2. 시스템 구성 — 실선이 지금의 운영 경로"/>
+            <wp:docPr id="1" name="arch" descr="그림 2. 시스템 구성 — 관리자 웹과 회원 모바일 웹이 같은 Worker를 거친다" title="그림 2. 시스템 구성 — 관리자 웹과 회원 모바일 웹이 같은 Worker를 거친다"/>
             <wp:cNvGraphicFramePr>
               <a:graphicFrameLocks xmlns:a="http://schemas.openxmlformats.org/drawingml/2006/main" noChangeAspect="1"/>
             </wp:cNvGraphicFramePr>
@@ -5144,7 +5165,7 @@
           <w:sz w:val="18"/>
           <w:szCs w:val="18"/>
         </w:rPr>
-        <w:t xml:space="preserve">그림 2. 시스템 구성 — 실선이 지금의 운영 경로</w:t>
+        <w:t xml:space="preserve">그림 2. 시스템 구성 — 관리자 웹과 회원 모바일 웹이 같은 Worker를 거친다</w:t>
       </w:r>
     </w:p>
     <w:p>
@@ -5297,7 +5318,7 @@
                 <w:sz w:val="18"/>
                 <w:szCs w:val="18"/>
               </w:rPr>
-              <w:t xml:space="preserve">관리자 웹(본사·지점 관리자·직원), 회원 모바일 웹(개발 예정), REST API, 실DB, 9개 도메인 — 권한관리·인사정보관리·근태관리·게시판·회원관리·예약및결제·강사프로그램게시·혼잡도관리·자원문서관리</w:t>
+              <w:t xml:space="preserve">관리자 웹(본사·지점 관리자·직원), 회원 모바일 웹(2026-10-09 배포), REST API, 실DB, 9개 도메인 — 권한관리·인사정보관리·근태관리·게시판·회원관리·예약및결제·강사프로그램게시·혼잡도관리·자원문서관리</w:t>
             </w:r>
           </w:p>
         </w:tc>
@@ -5670,7 +5691,7 @@
         <w:spacing w:after="60" w:line="290"/>
       </w:pPr>
       <w:r>
-        <w:t xml:space="preserve">처리 성능은 문제가 아니다 — 피크 시간대 약 3 rps, 순간 몰림을 크게 잡아도 약 8 rps(계산값)이고, Lambda 위에서 실측한 처리 한계는 약 50 rps다(2026-10-04 k6). 동시 실행 상한 10은 관리자·회원 요청이 함께 쓴다.</w:t>
+        <w:t xml:space="preserve">처리 성능은 평균으로는 문제가 아니다 — 피크 시간대 약 3 rps, 순간 몰림을 크게 잡아도 약 8 rps(계산값)이고, 운영 Lambda에서 잰 요청당 처리 시간은 약 40ms, 과부하에서 실제로 처리한 양은 약 80~90 rps다(2026-10-12 k6·CloudWatch, 측정 PC가 먼저 막혀 하한). 동시 실행 상한 10은 관리자·회원 요청이 함께 쓴다. 다만 순간 몰림과 콜드 스타트 때 상한에 닿아 일부 요청이 거절됐고, 원인은 확인 중이다.</w:t>
       </w:r>
     </w:p>
     <w:p>
@@ -5683,7 +5704,7 @@
         <w:spacing w:after="60" w:line="290"/>
       </w:pPr>
       <w:r>
-        <w:t xml:space="preserve">회원 기능의 API(가입·연동·예약·결제·게시판 열람)는 이미 구현돼 있다. 지금은 회원 계정으로 관리자 웹에 로그인해 쓸 수 있다.</w:t>
+        <w:t xml:space="preserve">회원 모바일 웹(`/m/`)은 2026-10-09 배포했다 — 로그인, 프로그램·회차 조회, 예약·모의 결제·취소, 공지, 혼잡도, 내 정보, 가입·지점 회원 연동. 홈 화면에 설치할 수 있다(PWA).</w:t>
       </w:r>
     </w:p>
     <w:p>
@@ -5996,7 +6017,7 @@
                 <w:sz w:val="18"/>
                 <w:szCs w:val="18"/>
               </w:rPr>
-              <w:t xml:space="preserve">자체 개발은 구현, </w:t>
+              <w:t xml:space="preserve">자체 개발은 구현, 변경 이력은 </w:t>
             </w:r>
             <w:r>
               <w:rPr>
@@ -6005,7 +6026,14 @@
                 <w:sz w:val="18"/>
                 <w:szCs w:val="18"/>
               </w:rPr>
-              <w:t xml:space="preserve">변경 이력은 미구현</w:t>
+              <w:t xml:space="preserve">부분 구현</w:t>
+            </w:r>
+            <w:r>
+              <w:rPr>
+                <w:sz w:val="18"/>
+                <w:szCs w:val="18"/>
+              </w:rPr>
+              <w:t xml:space="preserve">(인사 변경·전화번호 열람만)</w:t>
             </w:r>
           </w:p>
         </w:tc>
@@ -6919,6 +6947,186 @@
           </w:p>
         </w:tc>
       </w:tr>
+      <w:tr>
+        <w:tc>
+          <w:tcPr>
+            <w:tcW w:type="dxa" w:w="2141"/>
+            <w:tcBorders>
+              <w:top w:val="single" w:color="CBD0CD" w:sz="4"/>
+              <w:left w:val="single" w:color="CBD0CD" w:sz="4"/>
+              <w:bottom w:val="single" w:color="CBD0CD" w:sz="4"/>
+              <w:right w:val="single" w:color="CBD0CD" w:sz="4"/>
+            </w:tcBorders>
+            <w:tcMar>
+              <w:top w:type="dxa" w:w="60"/>
+              <w:left w:type="dxa" w:w="100"/>
+              <w:bottom w:type="dxa" w:w="60"/>
+              <w:right w:type="dxa" w:w="100"/>
+            </w:tcMar>
+          </w:tcPr>
+          <w:p>
+            <w:pPr>
+              <w:spacing w:after="0" w:line="260"/>
+            </w:pPr>
+            <w:r>
+              <w:rPr>
+                <w:sz w:val="18"/>
+                <w:szCs w:val="18"/>
+              </w:rPr>
+              <w:t xml:space="preserve">10월 7~9일</w:t>
+            </w:r>
+          </w:p>
+        </w:tc>
+        <w:tc>
+          <w:tcPr>
+            <w:tcW w:type="dxa" w:w="7497"/>
+            <w:tcBorders>
+              <w:top w:val="single" w:color="CBD0CD" w:sz="4"/>
+              <w:left w:val="single" w:color="CBD0CD" w:sz="4"/>
+              <w:bottom w:val="single" w:color="CBD0CD" w:sz="4"/>
+              <w:right w:val="single" w:color="CBD0CD" w:sz="4"/>
+            </w:tcBorders>
+            <w:tcMar>
+              <w:top w:type="dxa" w:w="60"/>
+              <w:left w:type="dxa" w:w="100"/>
+              <w:bottom w:type="dxa" w:w="60"/>
+              <w:right w:type="dxa" w:w="100"/>
+            </w:tcMar>
+          </w:tcPr>
+          <w:p>
+            <w:pPr>
+              <w:spacing w:after="0" w:line="260"/>
+            </w:pPr>
+            <w:r>
+              <w:rPr>
+                <w:sz w:val="18"/>
+                <w:szCs w:val="18"/>
+              </w:rPr>
+              <w:t xml:space="preserve">목록 페이지네이션·전화번호 마스킹, 변경 이력(인사)·공통 알림, 회원 모바일 웹 구현·배포, 인사·비밀번호·가입·연동 화면, 화면별 도움말</w:t>
+            </w:r>
+          </w:p>
+        </w:tc>
+      </w:tr>
+      <w:tr>
+        <w:tc>
+          <w:tcPr>
+            <w:tcW w:type="dxa" w:w="2141"/>
+            <w:tcBorders>
+              <w:top w:val="single" w:color="CBD0CD" w:sz="4"/>
+              <w:left w:val="single" w:color="CBD0CD" w:sz="4"/>
+              <w:bottom w:val="single" w:color="CBD0CD" w:sz="4"/>
+              <w:right w:val="single" w:color="CBD0CD" w:sz="4"/>
+            </w:tcBorders>
+            <w:tcMar>
+              <w:top w:type="dxa" w:w="60"/>
+              <w:left w:type="dxa" w:w="100"/>
+              <w:bottom w:type="dxa" w:w="60"/>
+              <w:right w:type="dxa" w:w="100"/>
+            </w:tcMar>
+          </w:tcPr>
+          <w:p>
+            <w:pPr>
+              <w:spacing w:after="0" w:line="260"/>
+            </w:pPr>
+            <w:r>
+              <w:rPr>
+                <w:sz w:val="18"/>
+                <w:szCs w:val="18"/>
+              </w:rPr>
+              <w:t xml:space="preserve">10월 10일</w:t>
+            </w:r>
+          </w:p>
+        </w:tc>
+        <w:tc>
+          <w:tcPr>
+            <w:tcW w:type="dxa" w:w="7497"/>
+            <w:tcBorders>
+              <w:top w:val="single" w:color="CBD0CD" w:sz="4"/>
+              <w:left w:val="single" w:color="CBD0CD" w:sz="4"/>
+              <w:bottom w:val="single" w:color="CBD0CD" w:sz="4"/>
+              <w:right w:val="single" w:color="CBD0CD" w:sz="4"/>
+            </w:tcBorders>
+            <w:tcMar>
+              <w:top w:type="dxa" w:w="60"/>
+              <w:left w:type="dxa" w:w="100"/>
+              <w:bottom w:type="dxa" w:w="60"/>
+              <w:right w:type="dxa" w:w="100"/>
+            </w:tcMar>
+          </w:tcPr>
+          <w:p>
+            <w:pPr>
+              <w:spacing w:after="0" w:line="260"/>
+            </w:pPr>
+            <w:r>
+              <w:rPr>
+                <w:sz w:val="18"/>
+                <w:szCs w:val="18"/>
+              </w:rPr>
+              <w:t xml:space="preserve">지점 격리 검사를 전역 가드 한 곳으로 모음, 전화번호 열람 기록, 계약 상태 변경·파견 자동 종료·재배치 대기, 결근 확정·자산 수정 화면</w:t>
+            </w:r>
+          </w:p>
+        </w:tc>
+      </w:tr>
+      <w:tr>
+        <w:tc>
+          <w:tcPr>
+            <w:tcW w:type="dxa" w:w="2141"/>
+            <w:tcBorders>
+              <w:top w:val="single" w:color="CBD0CD" w:sz="4"/>
+              <w:left w:val="single" w:color="CBD0CD" w:sz="4"/>
+              <w:bottom w:val="single" w:color="CBD0CD" w:sz="4"/>
+              <w:right w:val="single" w:color="CBD0CD" w:sz="4"/>
+            </w:tcBorders>
+            <w:tcMar>
+              <w:top w:type="dxa" w:w="60"/>
+              <w:left w:type="dxa" w:w="100"/>
+              <w:bottom w:type="dxa" w:w="60"/>
+              <w:right w:type="dxa" w:w="100"/>
+            </w:tcMar>
+          </w:tcPr>
+          <w:p>
+            <w:pPr>
+              <w:spacing w:after="0" w:line="260"/>
+            </w:pPr>
+            <w:r>
+              <w:rPr>
+                <w:sz w:val="18"/>
+                <w:szCs w:val="18"/>
+              </w:rPr>
+              <w:t xml:space="preserve">10월 10~12일</w:t>
+            </w:r>
+          </w:p>
+        </w:tc>
+        <w:tc>
+          <w:tcPr>
+            <w:tcW w:type="dxa" w:w="7497"/>
+            <w:tcBorders>
+              <w:top w:val="single" w:color="CBD0CD" w:sz="4"/>
+              <w:left w:val="single" w:color="CBD0CD" w:sz="4"/>
+              <w:bottom w:val="single" w:color="CBD0CD" w:sz="4"/>
+              <w:right w:val="single" w:color="CBD0CD" w:sz="4"/>
+            </w:tcBorders>
+            <w:tcMar>
+              <w:top w:type="dxa" w:w="60"/>
+              <w:left w:type="dxa" w:w="100"/>
+              <w:bottom w:type="dxa" w:w="60"/>
+              <w:right w:type="dxa" w:w="100"/>
+            </w:tcMar>
+          </w:tcPr>
+          <w:p>
+            <w:pPr>
+              <w:spacing w:after="0" w:line="260"/>
+            </w:pPr>
+            <w:r>
+              <w:rPr>
+                <w:sz w:val="18"/>
+                <w:szCs w:val="18"/>
+              </w:rPr>
+              <w:t xml:space="preserve">처리 한계 원인 측정(DB 풀러 모드의 작업당 왕복) → DB 접속을 Session pooler로 전환 → 운영 재측정: 요청당 처리 시간 약 110ms → 약 40ms</w:t>
+            </w:r>
+          </w:p>
+        </w:tc>
+      </w:tr>
     </w:tbl>
     <w:p>
       <w:pPr>
@@ -7130,7 +7338,7 @@
                 <w:sz w:val="18"/>
                 <w:szCs w:val="18"/>
               </w:rPr>
-              <w:t xml:space="preserve">78개</w:t>
+              <w:t xml:space="preserve">81개</w:t>
             </w:r>
           </w:p>
         </w:tc>
@@ -7190,7 +7398,7 @@
                 <w:sz w:val="18"/>
                 <w:szCs w:val="18"/>
               </w:rPr>
-              <w:t xml:space="preserve">16개</w:t>
+              <w:t xml:space="preserve">18개</w:t>
             </w:r>
           </w:p>
         </w:tc>
@@ -7221,7 +7429,7 @@
                 <w:sz w:val="18"/>
                 <w:szCs w:val="18"/>
               </w:rPr>
-              <w:t xml:space="preserve">DB 테이블</w:t>
+              <w:t xml:space="preserve">회원 웹 화면</w:t>
             </w:r>
           </w:p>
         </w:tc>
@@ -7250,7 +7458,7 @@
                 <w:sz w:val="18"/>
                 <w:szCs w:val="18"/>
               </w:rPr>
-              <w:t xml:space="preserve">31개(코드에서 쓰지 않는 7개 포함)</w:t>
+              <w:t xml:space="preserve">12개</w:t>
             </w:r>
           </w:p>
         </w:tc>
@@ -7281,6 +7489,66 @@
                 <w:sz w:val="18"/>
                 <w:szCs w:val="18"/>
               </w:rPr>
+              <w:t xml:space="preserve">DB 테이블</w:t>
+            </w:r>
+          </w:p>
+        </w:tc>
+        <w:tc>
+          <w:tcPr>
+            <w:tcW w:type="dxa" w:w="7229"/>
+            <w:tcBorders>
+              <w:top w:val="single" w:color="CBD0CD" w:sz="4"/>
+              <w:left w:val="single" w:color="CBD0CD" w:sz="4"/>
+              <w:bottom w:val="single" w:color="CBD0CD" w:sz="4"/>
+              <w:right w:val="single" w:color="CBD0CD" w:sz="4"/>
+            </w:tcBorders>
+            <w:tcMar>
+              <w:top w:type="dxa" w:w="60"/>
+              <w:left w:type="dxa" w:w="100"/>
+              <w:bottom w:type="dxa" w:w="60"/>
+              <w:right w:type="dxa" w:w="100"/>
+            </w:tcMar>
+          </w:tcPr>
+          <w:p>
+            <w:pPr>
+              <w:spacing w:after="0" w:line="260"/>
+            </w:pPr>
+            <w:r>
+              <w:rPr>
+                <w:sz w:val="18"/>
+                <w:szCs w:val="18"/>
+              </w:rPr>
+              <w:t xml:space="preserve">31개(코드에서 쓰지 않는 6개 포함)</w:t>
+            </w:r>
+          </w:p>
+        </w:tc>
+      </w:tr>
+      <w:tr>
+        <w:tc>
+          <w:tcPr>
+            <w:tcW w:type="dxa" w:w="2409"/>
+            <w:tcBorders>
+              <w:top w:val="single" w:color="CBD0CD" w:sz="4"/>
+              <w:left w:val="single" w:color="CBD0CD" w:sz="4"/>
+              <w:bottom w:val="single" w:color="CBD0CD" w:sz="4"/>
+              <w:right w:val="single" w:color="CBD0CD" w:sz="4"/>
+            </w:tcBorders>
+            <w:tcMar>
+              <w:top w:type="dxa" w:w="60"/>
+              <w:left w:type="dxa" w:w="100"/>
+              <w:bottom w:type="dxa" w:w="60"/>
+              <w:right w:type="dxa" w:w="100"/>
+            </w:tcMar>
+          </w:tcPr>
+          <w:p>
+            <w:pPr>
+              <w:spacing w:after="0" w:line="260"/>
+            </w:pPr>
+            <w:r>
+              <w:rPr>
+                <w:sz w:val="18"/>
+                <w:szCs w:val="18"/>
+              </w:rPr>
               <w:t xml:space="preserve">API 자동 테스트 파일</w:t>
             </w:r>
           </w:p>
@@ -7310,7 +7578,7 @@
                 <w:sz w:val="18"/>
                 <w:szCs w:val="18"/>
               </w:rPr>
-              <w:t xml:space="preserve">28개 — 불변식 3개와 실DB 동시성 중심. 관리자 웹은 자동 테스트 없이 lint·빌드까지만 검증</w:t>
+              <w:t xml:space="preserve">35개 — 불변식 3개와 실DB 동시성 중심. 관리자 웹·회원 웹은 자동 테스트 없이 lint·빌드까지만 검증</w:t>
             </w:r>
           </w:p>
         </w:tc>
@@ -7508,7 +7776,7 @@
                 <w:sz w:val="18"/>
                 <w:szCs w:val="18"/>
               </w:rPr>
-              <w:t xml:space="preserve">변경 이력</w:t>
+              <w:t xml:space="preserve">변경 이력 범위</w:t>
             </w:r>
           </w:p>
         </w:tc>
@@ -7537,7 +7805,7 @@
                 <w:sz w:val="18"/>
                 <w:szCs w:val="18"/>
               </w:rPr>
-              <w:t xml:space="preserve">테이블만 있고 기록하지 않음</w:t>
+              <w:t xml:space="preserve">인사 변경 4종과 전화번호 열람만 기록. 회원·자산 상태 변경, 근태 정정은 기록하지 않음</w:t>
             </w:r>
           </w:p>
         </w:tc>
@@ -7568,7 +7836,7 @@
                 <w:sz w:val="18"/>
                 <w:szCs w:val="18"/>
               </w:rPr>
-              <w:t xml:space="preserve">사용자인터페이스보안</w:t>
+              <w:t xml:space="preserve">인사정보관리</w:t>
             </w:r>
           </w:p>
         </w:tc>
@@ -7597,7 +7865,7 @@
                 <w:sz w:val="18"/>
                 <w:szCs w:val="18"/>
               </w:rPr>
-              <w:t xml:space="preserve">응답 민감정보 마스킹</w:t>
+              <w:t xml:space="preserve">인사 변경 신청 → 승인</w:t>
             </w:r>
           </w:p>
         </w:tc>
@@ -7626,7 +7894,7 @@
                 <w:sz w:val="18"/>
                 <w:szCs w:val="18"/>
               </w:rPr>
-              <w:t xml:space="preserve">없음</w:t>
+              <w:t xml:space="preserve">테이블만 있음</w:t>
             </w:r>
           </w:p>
         </w:tc>
@@ -7657,7 +7925,7 @@
                 <w:sz w:val="18"/>
                 <w:szCs w:val="18"/>
               </w:rPr>
-              <w:t xml:space="preserve">인사정보관리</w:t>
+              <w:t xml:space="preserve">게시판</w:t>
             </w:r>
           </w:p>
         </w:tc>
@@ -7686,7 +7954,7 @@
                 <w:sz w:val="18"/>
                 <w:szCs w:val="18"/>
               </w:rPr>
-              <w:t xml:space="preserve">인사 변경 신청 → 승인</w:t>
+              <w:t xml:space="preserve">본사→현장 교육자료 첨부</w:t>
             </w:r>
           </w:p>
         </w:tc>
@@ -7746,7 +8014,7 @@
                 <w:sz w:val="18"/>
                 <w:szCs w:val="18"/>
               </w:rPr>
-              <w:t xml:space="preserve">게시판</w:t>
+              <w:t xml:space="preserve">개념도(현장→본사)</w:t>
             </w:r>
           </w:p>
         </w:tc>
@@ -7775,7 +8043,7 @@
                 <w:sz w:val="18"/>
                 <w:szCs w:val="18"/>
               </w:rPr>
-              <w:t xml:space="preserve">본사→현장 교육자료 첨부</w:t>
+              <w:t xml:space="preserve">업무지원 요청</w:t>
             </w:r>
           </w:p>
         </w:tc>
@@ -7804,7 +8072,7 @@
                 <w:sz w:val="18"/>
                 <w:szCs w:val="18"/>
               </w:rPr>
-              <w:t xml:space="preserve">테이블만 있음</w:t>
+              <w:t xml:space="preserve">없음 — 새 테이블이 필요할 수 있다</w:t>
             </w:r>
           </w:p>
         </w:tc>
@@ -7835,7 +8103,7 @@
                 <w:sz w:val="18"/>
                 <w:szCs w:val="18"/>
               </w:rPr>
-              <w:t xml:space="preserve">온라인도움말·상호작용메시지</w:t>
+              <w:t xml:space="preserve">근태관리</w:t>
             </w:r>
           </w:p>
         </w:tc>
@@ -7864,7 +8132,7 @@
                 <w:sz w:val="18"/>
                 <w:szCs w:val="18"/>
               </w:rPr>
-              <w:t xml:space="preserve">공통 알림(Toast)·화면별 도움말</w:t>
+              <w:t xml:space="preserve">관리자의 직원 업무일지 열람</w:t>
             </w:r>
           </w:p>
         </w:tc>
@@ -7893,7 +8161,274 @@
                 <w:sz w:val="18"/>
                 <w:szCs w:val="18"/>
               </w:rPr>
-              <w:t xml:space="preserve">모달만 있음</w:t>
+              <w:t xml:space="preserve">API는 있고 화면 없음</w:t>
+            </w:r>
+          </w:p>
+        </w:tc>
+      </w:tr>
+      <w:tr>
+        <w:tc>
+          <w:tcPr>
+            <w:tcW w:type="dxa" w:w="3212"/>
+            <w:tcBorders>
+              <w:top w:val="single" w:color="CBD0CD" w:sz="4"/>
+              <w:left w:val="single" w:color="CBD0CD" w:sz="4"/>
+              <w:bottom w:val="single" w:color="CBD0CD" w:sz="4"/>
+              <w:right w:val="single" w:color="CBD0CD" w:sz="4"/>
+            </w:tcBorders>
+            <w:tcMar>
+              <w:top w:type="dxa" w:w="60"/>
+              <w:left w:type="dxa" w:w="100"/>
+              <w:bottom w:type="dxa" w:w="60"/>
+              <w:right w:type="dxa" w:w="100"/>
+            </w:tcMar>
+          </w:tcPr>
+          <w:p>
+            <w:pPr>
+              <w:spacing w:after="0" w:line="260"/>
+            </w:pPr>
+            <w:r>
+              <w:rPr>
+                <w:sz w:val="18"/>
+                <w:szCs w:val="18"/>
+              </w:rPr>
+              <w:t xml:space="preserve">강사,프로그램게시</w:t>
+            </w:r>
+          </w:p>
+        </w:tc>
+        <w:tc>
+          <w:tcPr>
+            <w:tcW w:type="dxa" w:w="3212"/>
+            <w:tcBorders>
+              <w:top w:val="single" w:color="CBD0CD" w:sz="4"/>
+              <w:left w:val="single" w:color="CBD0CD" w:sz="4"/>
+              <w:bottom w:val="single" w:color="CBD0CD" w:sz="4"/>
+              <w:right w:val="single" w:color="CBD0CD" w:sz="4"/>
+            </w:tcBorders>
+            <w:tcMar>
+              <w:top w:type="dxa" w:w="60"/>
+              <w:left w:type="dxa" w:w="100"/>
+              <w:bottom w:type="dxa" w:w="60"/>
+              <w:right w:type="dxa" w:w="100"/>
+            </w:tcMar>
+          </w:tcPr>
+          <w:p>
+            <w:pPr>
+              <w:spacing w:after="0" w:line="260"/>
+            </w:pPr>
+            <w:r>
+              <w:rPr>
+                <w:sz w:val="18"/>
+                <w:szCs w:val="18"/>
+              </w:rPr>
+              <w:t xml:space="preserve">종목·시간대·연령대별 목록</w:t>
+            </w:r>
+          </w:p>
+        </w:tc>
+        <w:tc>
+          <w:tcPr>
+            <w:tcW w:type="dxa" w:w="3214"/>
+            <w:tcBorders>
+              <w:top w:val="single" w:color="CBD0CD" w:sz="4"/>
+              <w:left w:val="single" w:color="CBD0CD" w:sz="4"/>
+              <w:bottom w:val="single" w:color="CBD0CD" w:sz="4"/>
+              <w:right w:val="single" w:color="CBD0CD" w:sz="4"/>
+            </w:tcBorders>
+            <w:tcMar>
+              <w:top w:type="dxa" w:w="60"/>
+              <w:left w:type="dxa" w:w="100"/>
+              <w:bottom w:type="dxa" w:w="60"/>
+              <w:right w:type="dxa" w:w="100"/>
+            </w:tcMar>
+          </w:tcPr>
+          <w:p>
+            <w:pPr>
+              <w:spacing w:after="0" w:line="260"/>
+            </w:pPr>
+            <w:r>
+              <w:rPr>
+                <w:sz w:val="18"/>
+                <w:szCs w:val="18"/>
+              </w:rPr>
+              <w:t xml:space="preserve">부분 구현(이용 방식으로만 구분)</w:t>
+            </w:r>
+          </w:p>
+        </w:tc>
+      </w:tr>
+      <w:tr>
+        <w:tc>
+          <w:tcPr>
+            <w:tcW w:type="dxa" w:w="3212"/>
+            <w:tcBorders>
+              <w:top w:val="single" w:color="CBD0CD" w:sz="4"/>
+              <w:left w:val="single" w:color="CBD0CD" w:sz="4"/>
+              <w:bottom w:val="single" w:color="CBD0CD" w:sz="4"/>
+              <w:right w:val="single" w:color="CBD0CD" w:sz="4"/>
+            </w:tcBorders>
+            <w:tcMar>
+              <w:top w:type="dxa" w:w="60"/>
+              <w:left w:type="dxa" w:w="100"/>
+              <w:bottom w:type="dxa" w:w="60"/>
+              <w:right w:type="dxa" w:w="100"/>
+            </w:tcMar>
+          </w:tcPr>
+          <w:p>
+            <w:pPr>
+              <w:spacing w:after="0" w:line="260"/>
+            </w:pPr>
+            <w:r>
+              <w:rPr>
+                <w:sz w:val="18"/>
+                <w:szCs w:val="18"/>
+              </w:rPr>
+              <w:t xml:space="preserve">시스템성능</w:t>
+            </w:r>
+          </w:p>
+        </w:tc>
+        <w:tc>
+          <w:tcPr>
+            <w:tcW w:type="dxa" w:w="3212"/>
+            <w:tcBorders>
+              <w:top w:val="single" w:color="CBD0CD" w:sz="4"/>
+              <w:left w:val="single" w:color="CBD0CD" w:sz="4"/>
+              <w:bottom w:val="single" w:color="CBD0CD" w:sz="4"/>
+              <w:right w:val="single" w:color="CBD0CD" w:sz="4"/>
+            </w:tcBorders>
+            <w:tcMar>
+              <w:top w:type="dxa" w:w="60"/>
+              <w:left w:type="dxa" w:w="100"/>
+              <w:bottom w:type="dxa" w:w="60"/>
+              <w:right w:type="dxa" w:w="100"/>
+            </w:tcMar>
+          </w:tcPr>
+          <w:p>
+            <w:pPr>
+              <w:spacing w:after="0" w:line="260"/>
+            </w:pPr>
+            <w:r>
+              <w:rPr>
+                <w:sz w:val="18"/>
+                <w:szCs w:val="18"/>
+              </w:rPr>
+              <w:t xml:space="preserve">느린 작업의 사용자 사전 알림</w:t>
+            </w:r>
+          </w:p>
+        </w:tc>
+        <w:tc>
+          <w:tcPr>
+            <w:tcW w:type="dxa" w:w="3214"/>
+            <w:tcBorders>
+              <w:top w:val="single" w:color="CBD0CD" w:sz="4"/>
+              <w:left w:val="single" w:color="CBD0CD" w:sz="4"/>
+              <w:bottom w:val="single" w:color="CBD0CD" w:sz="4"/>
+              <w:right w:val="single" w:color="CBD0CD" w:sz="4"/>
+            </w:tcBorders>
+            <w:tcMar>
+              <w:top w:type="dxa" w:w="60"/>
+              <w:left w:type="dxa" w:w="100"/>
+              <w:bottom w:type="dxa" w:w="60"/>
+              <w:right w:type="dxa" w:w="100"/>
+            </w:tcMar>
+          </w:tcPr>
+          <w:p>
+            <w:pPr>
+              <w:spacing w:after="0" w:line="260"/>
+            </w:pPr>
+            <w:r>
+              <w:rPr>
+                <w:sz w:val="18"/>
+                <w:szCs w:val="18"/>
+              </w:rPr>
+              <w:t xml:space="preserve">운영자 경보만 있음</w:t>
+            </w:r>
+          </w:p>
+        </w:tc>
+      </w:tr>
+      <w:tr>
+        <w:tc>
+          <w:tcPr>
+            <w:tcW w:type="dxa" w:w="3212"/>
+            <w:tcBorders>
+              <w:top w:val="single" w:color="CBD0CD" w:sz="4"/>
+              <w:left w:val="single" w:color="CBD0CD" w:sz="4"/>
+              <w:bottom w:val="single" w:color="CBD0CD" w:sz="4"/>
+              <w:right w:val="single" w:color="CBD0CD" w:sz="4"/>
+            </w:tcBorders>
+            <w:tcMar>
+              <w:top w:type="dxa" w:w="60"/>
+              <w:left w:type="dxa" w:w="100"/>
+              <w:bottom w:type="dxa" w:w="60"/>
+              <w:right w:type="dxa" w:w="100"/>
+            </w:tcMar>
+          </w:tcPr>
+          <w:p>
+            <w:pPr>
+              <w:spacing w:after="0" w:line="260"/>
+            </w:pPr>
+            <w:r>
+              <w:rPr>
+                <w:sz w:val="18"/>
+                <w:szCs w:val="18"/>
+              </w:rPr>
+              <w:t xml:space="preserve">과업4·산출물5</w:t>
+            </w:r>
+          </w:p>
+        </w:tc>
+        <w:tc>
+          <w:tcPr>
+            <w:tcW w:type="dxa" w:w="3212"/>
+            <w:tcBorders>
+              <w:top w:val="single" w:color="CBD0CD" w:sz="4"/>
+              <w:left w:val="single" w:color="CBD0CD" w:sz="4"/>
+              <w:bottom w:val="single" w:color="CBD0CD" w:sz="4"/>
+              <w:right w:val="single" w:color="CBD0CD" w:sz="4"/>
+            </w:tcBorders>
+            <w:tcMar>
+              <w:top w:type="dxa" w:w="60"/>
+              <w:left w:type="dxa" w:w="100"/>
+              <w:bottom w:type="dxa" w:w="60"/>
+              <w:right w:type="dxa" w:w="100"/>
+            </w:tcMar>
+          </w:tcPr>
+          <w:p>
+            <w:pPr>
+              <w:spacing w:after="0" w:line="260"/>
+            </w:pPr>
+            <w:r>
+              <w:rPr>
+                <w:sz w:val="18"/>
+                <w:szCs w:val="18"/>
+              </w:rPr>
+              <w:t xml:space="preserve">이용자 매뉴얼 앱 탑재</w:t>
+            </w:r>
+          </w:p>
+        </w:tc>
+        <w:tc>
+          <w:tcPr>
+            <w:tcW w:type="dxa" w:w="3214"/>
+            <w:tcBorders>
+              <w:top w:val="single" w:color="CBD0CD" w:sz="4"/>
+              <w:left w:val="single" w:color="CBD0CD" w:sz="4"/>
+              <w:bottom w:val="single" w:color="CBD0CD" w:sz="4"/>
+              <w:right w:val="single" w:color="CBD0CD" w:sz="4"/>
+            </w:tcBorders>
+            <w:tcMar>
+              <w:top w:type="dxa" w:w="60"/>
+              <w:left w:type="dxa" w:w="100"/>
+              <w:bottom w:type="dxa" w:w="60"/>
+              <w:right w:type="dxa" w:w="100"/>
+            </w:tcMar>
+          </w:tcPr>
+          <w:p>
+            <w:pPr>
+              <w:spacing w:after="0" w:line="260"/>
+            </w:pPr>
+            <w:r>
+              <w:rPr>
+                <w:sz w:val="18"/>
+                <w:szCs w:val="18"/>
+              </w:rPr>
+              <w:t xml:space="preserve">부분 구현(관리자 웹 도움말만)</w:t>
             </w:r>
           </w:p>
         </w:tc>
@@ -8143,7 +8678,7 @@
         <w:t xml:space="preserve">안정성은 숫자로 확인한다.</w:t>
       </w:r>
       <w:r>
-        <w:t xml:space="preserve"> 첫 배포에서 측정한 15초 지연을 계기로 실DB 전환과 Lambda 전환을 했고, 같은 조건으로 다시 재서 로그인 p95를 237ms로 줄였다. 다만 처리 한계(약 50 rps)가 설계 가정보다 작아 원인을 확인해야 한다.</w:t>
+        <w:t xml:space="preserve"> 첫 배포에서 측정한 15초 지연을 계기로 실DB 전환과 Lambda 전환을 했고, 같은 조건으로 다시 재서 로그인 p95를 237ms로 줄였다. 그다음 처리 한계(약 50 rps)의 원인을 측정해 DB 접속 방식을 바꿨고, 요청당 처리 시간이 약 110ms에서 약 40ms로 줄었다. 순간 몰림 때의 일부 거절은 원인을 아직 확인하지 못했다.</w:t>
       </w:r>
     </w:p>
     <w:p>
@@ -8163,7 +8698,7 @@
         <w:t xml:space="preserve">다음 우선순위</w:t>
       </w:r>
       <w:r>
-        <w:t xml:space="preserve"> — 회원 모바일 웹(수도권 83개) → 처리 한계(약 50 rps) 원인 확인 → 비용이 작은 미구현(변경 이력·마스킹·공통 알림) → 인사 화면(채용·재배치·퇴사) → 지역관리자 계층 필요성에 대한 발주사 확인.</w:t>
+        <w:t xml:space="preserve"> — 시연 데이터 고밀도화(계약 상태별 지점 5곳에 실제 같은 운영 이력) → 몰림 시 거절 원인 확인 → 남은 제안요청서 요구(업무지원 요청·인사 변경 신청·교육자료 첨부·업무일지 열람 화면) → 지역관리자 계층 필요성에 대한 발주사 확인.</w:t>
       </w:r>
     </w:p>
     <w:sectPr>

</xml_diff>